<commit_message>
fix: include owner name and coat color in outpatient drafts [skip render]
Use the saved case fields in outpatient DOCX and the confirmation preview. Keep missing values explicit and invalidate confirmation when either field changes.

Approved 2026-10-04 supplement: eight paths including the CI scope binding; one additional candidate CI. Preserve fixed main and M7 baselines, existing acceptance steps and thresholds.

Draft PR only; no merge, deployment, migration or production data access.
</commit_message>
<xml_diff>
--- a/templates/clinical_docs/outpatient_record_zh.docx
+++ b/templates/clinical_docs/outpatient_record_zh.docx
@@ -32,6 +32,12 @@
     <w:p>
       <w:r>
         <w:t>病例编号：{{visit.case_id}}    动物：{{visit.pet_name}}</w:t>
+      </w:r>
+    </w:p>
+    <w:p>
+      <w:pPr/>
+      <w:r>
+        <w:t>宠主姓名：{{visit.owner_name}}    宠物毛色：{{visit.coat_color}}</w:t>
       </w:r>
     </w:p>
     <w:p>

</xml_diff>